<commit_message>
modif dseq consulter un materiel, rechercher un materiel , creer une salle . modif README.md de app/SESAM-backend
</commit_message>
<xml_diff>
--- a/Analyse/Fiches-descriptive/UC04-Creer_une_salle.docx
+++ b/Analyse/Fiches-descriptive/UC04-Creer_une_salle.docx
@@ -75,16 +75,7 @@
                 <w:b/>
                 <w:noProof/>
               </w:rPr>
-              <w:t>UC</w:t>
-            </w:r>
-            <w:bookmarkStart w:id="0" w:name="_GoBack"/>
-            <w:bookmarkEnd w:id="0"/>
-            <w:r>
-              <w:rPr>
-                <w:b/>
-                <w:noProof/>
-              </w:rPr>
-              <w:t xml:space="preserve">04 - </w:t>
+              <w:t xml:space="preserve">UC04 - </w:t>
             </w:r>
             <w:r>
               <w:rPr>
@@ -1369,6 +1360,11 @@
         <w:spacing w:after="100" w:line="252" w:lineRule="auto"/>
       </w:pPr>
     </w:p>
+    <w:p>
+      <w:pPr>
+        <w:spacing w:after="100" w:line="252" w:lineRule="auto"/>
+      </w:pPr>
+    </w:p>
     <w:tbl>
       <w:tblPr>
         <w:tblW w:w="0" w:type="auto"/>
@@ -1416,8 +1412,34 @@
               <w:rPr>
                 <w:b/>
               </w:rPr>
-              <w:t>Scénario alternatif 2 : Annulation de la création</w:t>
-            </w:r>
+              <w:t xml:space="preserve">Scénario alternatif </w:t>
+            </w:r>
+            <w:r>
+              <w:rPr>
+                <w:b/>
+              </w:rPr>
+              <w:t>2</w:t>
+            </w:r>
+            <w:r>
+              <w:rPr>
+                <w:b/>
+              </w:rPr>
+              <w:t xml:space="preserve"> : </w:t>
+            </w:r>
+            <w:r>
+              <w:rPr>
+                <w:b/>
+              </w:rPr>
+              <w:t xml:space="preserve">Le nom existe </w:t>
+            </w:r>
+            <w:proofErr w:type="spellStart"/>
+            <w:r>
+              <w:rPr>
+                <w:b/>
+              </w:rPr>
+              <w:t>deja</w:t>
+            </w:r>
+            <w:proofErr w:type="spellEnd"/>
           </w:p>
         </w:tc>
       </w:tr>
@@ -1482,9 +1504,6 @@
               <w:keepNext/>
               <w:spacing w:after="60" w:line="252" w:lineRule="auto"/>
             </w:pPr>
-            <w:r>
-              <w:t>3a.1 Le gestionnaire sélectionne « Annuler ».</w:t>
-            </w:r>
           </w:p>
         </w:tc>
         <w:tc>
@@ -1498,6 +1517,14 @@
               <w:keepNext/>
               <w:spacing w:after="60" w:line="252" w:lineRule="auto"/>
             </w:pPr>
+            <w:r>
+              <w:t xml:space="preserve">6.a Le nom existe déjà en </w:t>
+            </w:r>
+            <w:proofErr w:type="spellStart"/>
+            <w:r>
+              <w:t>bdd</w:t>
+            </w:r>
+            <w:proofErr w:type="spellEnd"/>
           </w:p>
         </w:tc>
       </w:tr>
@@ -1531,7 +1558,13 @@
               <w:spacing w:after="60" w:line="252" w:lineRule="auto"/>
             </w:pPr>
             <w:r>
-              <w:t>3a.2 Le système annule la création et retourne à la liste des salles.</w:t>
+              <w:t>6</w:t>
+            </w:r>
+            <w:r>
+              <w:t xml:space="preserve">a.2 </w:t>
+            </w:r>
+            <w:r>
+              <w:t>Le système affiche un message indiquant que le nom existe déjà</w:t>
             </w:r>
           </w:p>
         </w:tc>
@@ -1564,7 +1597,15 @@
               <w:spacing w:after="60" w:line="252" w:lineRule="auto"/>
             </w:pPr>
             <w:r>
-              <w:t>3a.3 Fin du cas d’utilisation.</w:t>
+              <w:t>6</w:t>
+            </w:r>
+            <w:r>
+              <w:t>a.3 Retour à l’étape 3</w:t>
+            </w:r>
+            <w:bookmarkStart w:id="0" w:name="_GoBack"/>
+            <w:bookmarkEnd w:id="0"/>
+            <w:r>
+              <w:t>.</w:t>
             </w:r>
           </w:p>
         </w:tc>
@@ -1574,41 +1615,9 @@
       <w:pPr>
         <w:spacing w:after="100" w:line="252" w:lineRule="auto"/>
       </w:pPr>
-    </w:p>
-    <w:p>
-      <w:pPr>
-        <w:spacing w:after="100" w:line="252" w:lineRule="auto"/>
-      </w:pPr>
-    </w:p>
-    <w:p>
-      <w:pPr>
-        <w:spacing w:after="100" w:line="252" w:lineRule="auto"/>
-      </w:pPr>
-    </w:p>
-    <w:p>
-      <w:pPr>
-        <w:spacing w:after="100" w:line="252" w:lineRule="auto"/>
-      </w:pPr>
-    </w:p>
-    <w:p>
-      <w:pPr>
-        <w:spacing w:after="100" w:line="252" w:lineRule="auto"/>
-      </w:pPr>
-    </w:p>
-    <w:p>
-      <w:pPr>
-        <w:spacing w:after="100" w:line="252" w:lineRule="auto"/>
-      </w:pPr>
-    </w:p>
-    <w:p>
-      <w:pPr>
-        <w:spacing w:after="100" w:line="252" w:lineRule="auto"/>
-      </w:pPr>
-    </w:p>
-    <w:p>
-      <w:pPr>
-        <w:spacing w:after="100" w:line="252" w:lineRule="auto"/>
-      </w:pPr>
+      <w:r>
+        <w:t xml:space="preserve">  </w:t>
+      </w:r>
     </w:p>
     <w:p>
       <w:pPr>

</xml_diff>